<commit_message>
Point the status report at the commit it describes
Co-Authored-By: Claude Opus 5 <noreply@anthropic.com>
Claude-Session: https://claude.ai/code/session_019QQch8dT1b2s5WZuEdatuQ
</commit_message>
<xml_diff>
--- a/docs/SPIMS-Project-Status.docx
+++ b/docs/SPIMS-Project-Status.docx
@@ -81,7 +81,7 @@
           <w:sz w:val="18"/>
           <w:szCs w:val="18"/>
         </w:rPr>
-        <w:t xml:space="preserve">Version 1.7  ·  11 September 2026  ·  build 9ce26d7</w:t>
+        <w:t xml:space="preserve">Version 1.7  ·  11 September 2026  ·  build b6ca64a</w:t>
       </w:r>
     </w:p>
     <w:p>
@@ -484,7 +484,7 @@
                 <w:sz w:val="19"/>
                 <w:szCs w:val="19"/>
               </w:rPr>
-              <w:t xml:space="preserve">32 API endpoints, all authenticated. Written as hosting-agnostic handlers so the same logic runs self-hosted or serverless without a second implementation.</w:t>
+              <w:t xml:space="preserve">41 API endpoints, all authenticated. Written as hosting-agnostic handlers called by a single adapter, so managed hosting runs the same application as a Seplat-hosted install rather than a second implementation of it.</w:t>
             </w:r>
           </w:p>
         </w:tc>

</xml_diff>